<commit_message>
AB01/AB02: Fließtext durchgängig 11 pt
Co-Authored-By: Claude Opus 5.5 <noreply@anthropic.com>
Claude-Session: https://claude.ai/code/session_01UGobrY1ZfehGBmAbNorV43
</commit_message>
<xml_diff>
--- a/Arbeitsblaetter/AB01_zu_Vorlesung_01a-1_-_Einführung_BWL.docx
+++ b/Arbeitsblaetter/AB01_zu_Vorlesung_01a-1_-_Einführung_BWL.docx
@@ -61,7 +61,7 @@
             <w:r>
               <w:rPr>
                 <w:b/>
-                <w:sz w:val="20"/>
+                <w:sz w:val="22"/>
               </w:rPr>
               <w:t>Sitzung am:</w:t>
             </w:r>
@@ -82,7 +82,7 @@
             <w:r>
               <w:rPr>
                 <w:b/>
-                <w:sz w:val="20"/>
+                <w:sz w:val="22"/>
               </w:rPr>
             </w:r>
           </w:p>
@@ -99,7 +99,7 @@
             <w:r>
               <w:rPr>
                 <w:b/>
-                <w:sz w:val="20"/>
+                <w:sz w:val="22"/>
               </w:rPr>
               <w:t>Pseudonym:</w:t>
             </w:r>
@@ -120,7 +120,7 @@
             <w:r>
               <w:rPr>
                 <w:b/>
-                <w:sz w:val="20"/>
+                <w:sz w:val="22"/>
               </w:rPr>
             </w:r>
           </w:p>
@@ -135,7 +135,7 @@
       <w:r>
         <w:rPr>
           <w:color w:val="666666"/>
-          <w:sz w:val="16"/>
+          <w:sz w:val="22"/>
         </w:rPr>
         <w:t>Pseudonym: selbst gewählt, ein Wort, max. 15 Buchstaben</w:t>
       </w:r>
@@ -152,7 +152,7 @@
         <w:rPr>
           <w:b/>
           <w:color w:val="1F4E79"/>
-          <w:sz w:val="19"/>
+          <w:sz w:val="22"/>
         </w:rPr>
         <w:t>VOR- UND NACHBEREITUNG DER SITZUNG</w:t>
       </w:r>
@@ -166,7 +166,7 @@
         <w:rPr>
           <w:b w:val="0"/>
           <w:i w:val="0"/>
-          <w:sz w:val="20"/>
+          <w:sz w:val="22"/>
         </w:rPr>
         <w:t>Studieren Sie den Foliensatz „01a – Einführung in Betriebswirtschaftliche Grundlagen“ (CampUAS)</w:t>
       </w:r>
@@ -183,7 +183,7 @@
         <w:rPr>
           <w:b/>
           <w:color w:val="1F4E79"/>
-          <w:sz w:val="19"/>
+          <w:sz w:val="22"/>
         </w:rPr>
         <w:t>AUFGABEN</w:t>
       </w:r>
@@ -227,7 +227,7 @@
         <w:rPr>
           <w:i/>
           <w:color w:val="666666"/>
-          <w:sz w:val="20"/>
+          <w:sz w:val="22"/>
         </w:rPr>
         <w:t xml:space="preserve">  (1–2 Sätze)</w:t>
       </w:r>
@@ -387,7 +387,7 @@
             <w:r>
               <w:rPr>
                 <w:b/>
-                <w:sz w:val="20"/>
+                <w:sz w:val="22"/>
               </w:rPr>
             </w:r>
           </w:p>
@@ -405,7 +405,7 @@
             <w:r>
               <w:rPr>
                 <w:b/>
-                <w:sz w:val="20"/>
+                <w:sz w:val="22"/>
               </w:rPr>
               <w:t>BWL</w:t>
             </w:r>
@@ -424,7 +424,7 @@
             <w:r>
               <w:rPr>
                 <w:b/>
-                <w:sz w:val="20"/>
+                <w:sz w:val="22"/>
               </w:rPr>
               <w:t>VWL</w:t>
             </w:r>
@@ -445,7 +445,7 @@
             <w:r>
               <w:rPr>
                 <w:b/>
-                <w:sz w:val="20"/>
+                <w:sz w:val="22"/>
               </w:rPr>
               <w:t>Ziel</w:t>
             </w:r>
@@ -514,7 +514,7 @@
             <w:r>
               <w:rPr>
                 <w:b/>
-                <w:sz w:val="20"/>
+                <w:sz w:val="22"/>
               </w:rPr>
             </w:r>
           </w:p>
@@ -532,7 +532,7 @@
             <w:r>
               <w:rPr>
                 <w:b/>
-                <w:sz w:val="20"/>
+                <w:sz w:val="22"/>
               </w:rPr>
               <w:t>Unternehmen</w:t>
             </w:r>
@@ -551,7 +551,7 @@
             <w:r>
               <w:rPr>
                 <w:b/>
-                <w:sz w:val="20"/>
+                <w:sz w:val="22"/>
               </w:rPr>
               <w:t>Betrieb</w:t>
             </w:r>
@@ -575,7 +575,7 @@
             <w:r>
               <w:rPr>
                 <w:b/>
-                <w:sz w:val="20"/>
+                <w:sz w:val="22"/>
               </w:rPr>
               <w:t>Beispiel Bäckereikette</w:t>
             </w:r>
@@ -616,7 +616,7 @@
             <w:r>
               <w:rPr>
                 <w:b/>
-                <w:sz w:val="20"/>
+                <w:sz w:val="22"/>
               </w:rPr>
               <w:t>Ziel</w:t>
             </w:r>
@@ -685,7 +685,7 @@
             <w:r>
               <w:rPr>
                 <w:b/>
-                <w:sz w:val="20"/>
+                <w:sz w:val="22"/>
               </w:rPr>
             </w:r>
           </w:p>
@@ -703,7 +703,7 @@
             <w:r>
               <w:rPr>
                 <w:b/>
-                <w:sz w:val="20"/>
+                <w:sz w:val="22"/>
               </w:rPr>
               <w:t>Haushalte</w:t>
             </w:r>
@@ -722,7 +722,7 @@
             <w:r>
               <w:rPr>
                 <w:b/>
-                <w:sz w:val="20"/>
+                <w:sz w:val="22"/>
               </w:rPr>
               <w:t>Betriebe</w:t>
             </w:r>
@@ -746,7 +746,7 @@
             <w:r>
               <w:rPr>
                 <w:b/>
-                <w:sz w:val="20"/>
+                <w:sz w:val="22"/>
               </w:rPr>
               <w:t>kauft und verbraucht Güter für den eigenen Bedarf</w:t>
             </w:r>
@@ -787,7 +787,7 @@
             <w:r>
               <w:rPr>
                 <w:b/>
-                <w:sz w:val="20"/>
+                <w:sz w:val="22"/>
               </w:rPr>
               <w:t>stellt Güter für den Bedarf anderer her</w:t>
             </w:r>
@@ -851,7 +851,7 @@
         <w:rPr>
           <w:i/>
           <w:color w:val="666666"/>
-          <w:sz w:val="20"/>
+          <w:sz w:val="22"/>
         </w:rPr>
         <w:t xml:space="preserve">  (je 1 Satz)</w:t>
       </w:r>
@@ -896,7 +896,7 @@
             <w:r>
               <w:rPr>
                 <w:b/>
-                <w:sz w:val="20"/>
+                <w:sz w:val="22"/>
               </w:rPr>
               <w:t xml:space="preserve">Bedürfnis:</w:t>
             </w:r>
@@ -949,7 +949,7 @@
             <w:r>
               <w:rPr>
                 <w:b/>
-                <w:sz w:val="20"/>
+                <w:sz w:val="22"/>
               </w:rPr>
               <w:t xml:space="preserve">Bedarf:</w:t>
             </w:r>
@@ -1002,7 +1002,7 @@
             <w:r>
               <w:rPr>
                 <w:b/>
-                <w:sz w:val="20"/>
+                <w:sz w:val="22"/>
               </w:rPr>
               <w:t xml:space="preserve">Nachfrage:</w:t>
             </w:r>
@@ -1110,7 +1110,7 @@
         <w:rPr>
           <w:i/>
           <w:color w:val="666666"/>
-          <w:sz w:val="20"/>
+          <w:sz w:val="22"/>
         </w:rPr>
         <w:t xml:space="preserve">  (2–3 Sätze)</w:t>
       </w:r>
@@ -1272,7 +1272,7 @@
             <w:r>
               <w:rPr>
                 <w:b/>
-                <w:sz w:val="20"/>
+                <w:sz w:val="22"/>
               </w:rPr>
               <w:t>Situation</w:t>
             </w:r>
@@ -1291,7 +1291,7 @@
             <w:r>
               <w:rPr>
                 <w:b/>
-                <w:sz w:val="20"/>
+                <w:sz w:val="22"/>
               </w:rPr>
               <w:t>Maximum</w:t>
             </w:r>
@@ -1310,7 +1310,7 @@
             <w:r>
               <w:rPr>
                 <w:b/>
-                <w:sz w:val="20"/>
+                <w:sz w:val="22"/>
               </w:rPr>
               <w:t>Minimum</w:t>
             </w:r>
@@ -1329,7 +1329,7 @@
             <w:r>
               <w:rPr>
                 <w:b/>
-                <w:sz w:val="20"/>
+                <w:sz w:val="22"/>
               </w:rPr>
               <w:t>Optimum</w:t>
             </w:r>
@@ -1353,7 +1353,7 @@
             <w:r>
               <w:rPr>
                 <w:b/>
-                <w:sz w:val="20"/>
+                <w:sz w:val="22"/>
               </w:rPr>
               <w:t>Büro vollständig reinigen, mit möglichst wenigen Personalstunden</w:t>
             </w:r>
@@ -1407,7 +1407,7 @@
             <w:r>
               <w:rPr>
                 <w:b/>
-                <w:sz w:val="20"/>
+                <w:sz w:val="22"/>
               </w:rPr>
               <w:t>Mit 30 € möglichst viele Lebensmittel kaufen</w:t>
             </w:r>
@@ -1458,7 +1458,7 @@
             <w:r>
               <w:rPr>
                 <w:b/>
-                <w:sz w:val="20"/>
+                <w:sz w:val="22"/>
               </w:rPr>
               <w:t>Ohne Vorgabe das günstigste Verhältnis von Input und Output suchen</w:t>
             </w:r>
@@ -1507,7 +1507,7 @@
         <w:rPr>
           <w:i/>
           <w:color w:val="666666"/>
-          <w:sz w:val="20"/>
+          <w:sz w:val="22"/>
         </w:rPr>
         <w:t xml:space="preserve">  (ca. 3 Sätze)</w:t>
       </w:r>
@@ -1720,7 +1720,7 @@
         <w:rPr>
           <w:i/>
           <w:color w:val="666666"/>
-          <w:sz w:val="20"/>
+          <w:sz w:val="22"/>
         </w:rPr>
         <w:t xml:space="preserve">  (2 Sätze)</w:t>
       </w:r>
@@ -1765,7 +1765,7 @@
             <w:r>
               <w:rPr>
                 <w:b/>
-                <w:sz w:val="20"/>
+                <w:sz w:val="22"/>
               </w:rPr>
               <w:t xml:space="preserve">Unterschied:</w:t>
             </w:r>
@@ -1818,7 +1818,7 @@
             <w:r>
               <w:rPr>
                 <w:b/>
-                <w:sz w:val="20"/>
+                <w:sz w:val="22"/>
               </w:rPr>
               <w:t xml:space="preserve">Formalziel:</w:t>
             </w:r>
@@ -1847,7 +1847,7 @@
             <w:r>
               <w:rPr>
                 <w:b/>
-                <w:sz w:val="20"/>
+                <w:sz w:val="22"/>
               </w:rPr>
               <w:t xml:space="preserve">Sachziel:</w:t>
             </w:r>
@@ -1903,7 +1903,7 @@
               <w:rPr>
                 <w:i/>
                 <w:color w:val="666666"/>
-                <w:sz w:val="18"/>
+                <w:sz w:val="22"/>
               </w:rPr>
               <w:t>Rechenweg</w:t>
             </w:r>
@@ -1934,7 +1934,7 @@
         <w:rPr>
           <w:i/>
           <w:color w:val="666666"/>
-          <w:sz w:val="20"/>
+          <w:sz w:val="22"/>
         </w:rPr>
         <w:t xml:space="preserve">  (ca. 60 Worte)</w:t>
       </w:r>
@@ -1979,7 +1979,7 @@
             <w:r>
               <w:rPr>
                 <w:b/>
-                <w:sz w:val="20"/>
+                <w:sz w:val="22"/>
               </w:rPr>
               <w:t xml:space="preserve">1.</w:t>
             </w:r>
@@ -2032,7 +2032,7 @@
             <w:r>
               <w:rPr>
                 <w:b/>
-                <w:sz w:val="20"/>
+                <w:sz w:val="22"/>
               </w:rPr>
               <w:t xml:space="preserve">2.</w:t>
             </w:r>
@@ -2085,7 +2085,7 @@
         <w:rPr>
           <w:i/>
           <w:color w:val="666666"/>
-          <w:sz w:val="20"/>
+          <w:sz w:val="22"/>
         </w:rPr>
         <w:t xml:space="preserve">  (ca. 3 Sätze)</w:t>
       </w:r>
@@ -2252,7 +2252,7 @@
               <w:rPr>
                 <w:b w:val="0"/>
                 <w:i/>
-                <w:sz w:val="20"/>
+                <w:sz w:val="22"/>
               </w:rPr>
               <w:t xml:space="preserve">Im Anwendungsteil des Semesters entwickeln Sie einen Business Case: ein </w:t>
             </w:r>
@@ -2260,7 +2260,7 @@
               <w:rPr>
                 <w:b/>
                 <w:i/>
-                <w:sz w:val="20"/>
+                <w:sz w:val="22"/>
               </w:rPr>
               <w:t>Business Model Canvas</w:t>
             </w:r>
@@ -2268,7 +2268,7 @@
               <w:rPr>
                 <w:b w:val="0"/>
                 <w:i/>
-                <w:sz w:val="20"/>
+                <w:sz w:val="22"/>
               </w:rPr>
               <w:t xml:space="preserve"> und ein </w:t>
             </w:r>
@@ -2276,7 +2276,7 @@
               <w:rPr>
                 <w:b/>
                 <w:i/>
-                <w:sz w:val="20"/>
+                <w:sz w:val="22"/>
               </w:rPr>
               <w:t>Prozessmodell</w:t>
             </w:r>
@@ -2284,7 +2284,7 @@
               <w:rPr>
                 <w:b w:val="0"/>
                 <w:i/>
-                <w:sz w:val="20"/>
+                <w:sz w:val="22"/>
               </w:rPr>
               <w:t xml:space="preserve">, Ihre Abschlusspräsentation ist Ihr Gründungspitch. Machen Sie sich schon jetzt Gedanken und notieren Sie erste Ideen für ein </w:t>
             </w:r>
@@ -2292,7 +2292,7 @@
               <w:rPr>
                 <w:b/>
                 <w:i/>
-                <w:sz w:val="20"/>
+                <w:sz w:val="22"/>
               </w:rPr>
               <w:t>Business</w:t>
             </w:r>
@@ -2300,7 +2300,7 @@
               <w:rPr>
                 <w:b w:val="0"/>
                 <w:i/>
-                <w:sz w:val="20"/>
+                <w:sz w:val="22"/>
               </w:rPr>
               <w:t>, das Sie den Arbeitsblättern der ersten acht Wochen zugrunde legen: eine eigene Business-Idee oder auch ein kleines bestehendes Unternehmen.</w:t>
             </w:r>
@@ -2323,7 +2323,7 @@
               <w:rPr>
                 <w:i/>
                 <w:color w:val="666666"/>
-                <w:sz w:val="20"/>
+                <w:sz w:val="22"/>
               </w:rPr>
               <w:t xml:space="preserve">  (Stichpunkte)</w:t>
             </w:r>
@@ -2460,7 +2460,7 @@
                   <w:r>
                     <w:rPr>
                       <w:b/>
-                      <w:sz w:val="20"/>
+                      <w:sz w:val="22"/>
                     </w:rPr>
                     <w:t>Steckbrief</w:t>
                   </w:r>
@@ -2479,7 +2479,7 @@
                   <w:r>
                     <w:rPr>
                       <w:b/>
-                      <w:sz w:val="20"/>
+                      <w:sz w:val="22"/>
                     </w:rPr>
                     <w:t>Ihr Business</w:t>
                   </w:r>
@@ -2504,7 +2504,7 @@
                   <w:r>
                     <w:rPr>
                       <w:b/>
-                      <w:sz w:val="20"/>
+                      <w:sz w:val="22"/>
                     </w:rPr>
                     <w:t>Name</w:t>
                   </w:r>
@@ -2540,7 +2540,7 @@
                   <w:r>
                     <w:rPr>
                       <w:b/>
-                      <w:sz w:val="20"/>
+                      <w:sz w:val="22"/>
                     </w:rPr>
                     <w:t>Welches Produkt, welche Dienstleistung?</w:t>
                   </w:r>
@@ -2576,7 +2576,7 @@
                   <w:r>
                     <w:rPr>
                       <w:b/>
-                      <w:sz w:val="20"/>
+                      <w:sz w:val="22"/>
                     </w:rPr>
                     <w:t>Wer sind (potenzielle) KundInnen?</w:t>
                   </w:r>
@@ -2612,7 +2612,7 @@
                   <w:r>
                     <w:rPr>
                       <w:b/>
-                      <w:sz w:val="20"/>
+                      <w:sz w:val="22"/>
                     </w:rPr>
                     <w:t>Welches Bedürfnis befriedigt es? Stufe nach Maslow?</w:t>
                   </w:r>
@@ -2645,7 +2645,7 @@
                   <w:r>
                     <w:rPr>
                       <w:b/>
-                      <w:sz w:val="20"/>
+                      <w:sz w:val="22"/>
                     </w:rPr>
                     <w:t>Warum könnte das erfolgreich sein?</w:t>
                   </w:r>
@@ -2674,14 +2674,14 @@
               <w:rPr>
                 <w:b/>
                 <w:color w:val="1F4E79"/>
-                <w:sz w:val="19"/>
+                <w:sz w:val="22"/>
               </w:rPr>
               <w:t xml:space="preserve">Baustein für:  </w:t>
             </w:r>
             <w:r>
               <w:rPr>
                 <w:color w:val="1F4E79"/>
-                <w:sz w:val="19"/>
+                <w:sz w:val="22"/>
               </w:rPr>
               <w:t>Business Model Canvas: Wertangebote, Kundensegmente  ·  Gründungspitch: Business-Idee</w:t>
             </w:r>

</xml_diff>